<commit_message>
Legal basis: the Senate's public consultation and the right of petition (Constitution art. 51) instead of Law 52/2003
Law 52/2003 applies to the public administration (art. 4), not to Parliament. The
fallback e-mail, the personalised memo and the generated memos now cite the Senate's
consultation procedure and art. 51. The e-mail no longer says it obliges the Senate
to register the opinion: the Senate's page says opinions count when sent on its form.
</commit_message>
<xml_diff>
--- a/public/docs/Punct_de_vedere_B584-2026.docx
+++ b/public/docs/Punct_de_vedere_B584-2026.docx
@@ -158,7 +158,7 @@
           <w:sz w:val="22"/>
           <w:szCs w:val="22"/>
         </w:rPr>
-        <w:t xml:space="preserve">Introduce art. 58^4 în Legea nr. 448/2006 pentru acordarea unei indemnizații speciale de protecție socială adulților cu handicap grav, permanent și ireversibil dobândit înainte de 18 ani, care nu au putut realiza niciodată stagiu de cotizare.</w:t>
+        <w:t xml:space="preserve">Introduce art. 58^4 în Legea nr. 448/2006 pentru acordarea unei indemnizații speciale de protecție socială adulților cu handicap grav, permanent și ireversibil dobândit înainte de 18 ani, care nu îndeplinesc condițiile pentru o pensie proprie sau au o pensie proprie inferioară nivelului indemnizației.</w:t>
       </w:r>
     </w:p>
     <w:p>
@@ -279,7 +279,7 @@
           <w:sz w:val="18"/>
           <w:szCs w:val="18"/>
         </w:rPr>
-        <w:t xml:space="preserve">Generat prin platforma civică „La Straja Legii” • Referință proiect: B584/2026 (Cod Senat 28020)</w:t>
+        <w:t xml:space="preserve">Generat prin platforma civică destrajă.ro • Referință proiect: B584/2026 (Cod Senat 28020)</w:t>
       </w:r>
     </w:p>
     <w:sectPr>

</xml_diff>